<commit_message>
Complete CC18 artifacts and add repository licenses
</commit_message>
<xml_diff>
--- a/manuscript/Training_Randomness_final_ML.docx
+++ b/manuscript/Training_Randomness_final_ML.docx
@@ -3223,7 +3223,7 @@
         </w:rPr>
       </w:pPr>
       <w:r>
-        <w:t>Code, configurations, manifests and compact result tables are maintained in the private reproducibility repository https://github.com/tohmetovakylbek-creator/training-randomness-ablation-validity and will be made public with the accepted manuscript. Large checkpoints and per-example NPZ artifacts are archived separately with checksums. Every reported table and figure is generated by a released script; the OpenML summary was independently reproduced from all 17 per-task artifacts without numerical differences above 10⁻¹². Parts of the analysis code were drafted with generative-AI assistance, then reviewed, tested and verified by the authors.</w:t>
+        <w:t>Code, configurations, manifests and compact result tables are maintained in the public reproducibility repository https://github.com/tohmetovakylbek-creator/training-randomness-ablation-validity. The 17 OpenML-CC18 per-task NPZ artifacts are included with a recorded checksum; larger energy-domain checkpoints will be linked through a versioned archival release. Every reported table and figure is generated by a released script; the OpenML summary was independently reproduced from all 17 per-task artifacts without numerical differences above 10⁻¹². Parts of the analysis code were drafted with generative-AI assistance, then reviewed, tested and verified by the authors.</w:t>
       </w:r>
     </w:p>
     <w:p>
@@ -17218,7 +17218,7 @@
         </w:rPr>
       </w:pPr>
       <w:r>
-        <w:t>Data availability. UK-DALE, REFIT, SHEERM, ECL and the OpenML-CC18 tasks are publicly available from their originating repositories and are cited in the relevant methods sections. No new raw data were generated. Dataset-selection manifests and compact derived summaries are provided with the code; large generated prediction artifacts will be deposited in a versioned archive.</w:t>
+        <w:t>Data availability. UK-DALE, REFIT, SHEERM, ECL and the OpenML-CC18 tasks are publicly available from their originating repositories and are cited in the relevant methods sections. No new raw data were generated. Dataset-selection manifests, compact derived summaries and the 17 OpenML-CC18 per-task prediction artifacts are provided with the code; larger energy-domain artifacts will be linked through a versioned archival release.</w:t>
       </w:r>
     </w:p>
     <w:p>
@@ -17231,7 +17231,7 @@
         </w:rPr>
       </w:pPr>
       <w:r>
-        <w:t>Code availability. Source code, environment specifications, registrations, deviation logs, manifests and result-generation scripts are maintained at https://github.com/tohmetovakylbek-creator/training-randomness-ablation-validity. The repository is private during manuscript preparation and will be made public no later than publication. Large checkpoints and per-example artifacts will be linked through a versioned archival release.</w:t>
+        <w:t>Code availability. Source code, environment specifications, registrations, deviation logs, manifests and result-generation scripts are publicly available at https://github.com/tohmetovakylbek-creator/training-randomness-ablation-validity. The submitted version will be identified by a versioned archival release and persistent identifier. The 17 OpenML-CC18 per-task artifacts are included in the repository; larger energy-domain checkpoints will be linked through the archival release.</w:t>
       </w:r>
     </w:p>
     <w:p>

</xml_diff>

<commit_message>
Point DOI references to the Zenodo concept DOI
The README badge and both manuscript files (Reproducibility/Data
availability/Code availability in the main manuscript; the cover-page
archive line in the Supplementary) cited the version-specific DOI
(10.5281/zenodo.21935720), which goes stale on every new Zenodo
version. Switched all four references to the concept DOI
(10.5281/zenodo.21935719), which always resolves to the latest
version.
</commit_message>
<xml_diff>
--- a/manuscript/Training_Randomness_final_ML.docx
+++ b/manuscript/Training_Randomness_final_ML.docx
@@ -4817,7 +4817,7 @@
         <w:rPr>
           <w:lang w:val="en-US"/>
         </w:rPr>
-        <w:t>Code, configurations, registrations, compact results and per-example artifacts are maintained in the public reproducibility repository. A single results/results_manifest.csv records, for every experiment, domain, units, seed count, evaluation count, component, outcome, inferential status and source artifact. Tables and figures are generated from the corresponding released result files and archived at https://doi.org/10.5281/zenodo.21935720.</w:t>
+        <w:t>Code, configurations, registrations, compact results and per-example artifacts are maintained in the public reproducibility repository. A single results/results_manifest.csv records, for every experiment, domain, units, seed count, evaluation count, component, outcome, inferential status and source artifact. Tables and figures are generated from the corresponding released result files and archived at https://doi.org/10.5281/zenodo.21935719.</w:t>
       </w:r>
     </w:p>
     <w:p>
@@ -10976,7 +10976,7 @@
         <w:rPr>
           <w:lang w:val="en-US"/>
         </w:rPr>
-        <w:t>. UK-DALE, REFIT, SHEERM, ECL and the OpenML-CC18 tasks are publicly available from their originating repositories and are cited in the relevant methods sections. No new raw data were generated. Dataset-selection manifests, compact derived summaries and the 17 OpenML-CC18 per-task prediction artifacts are included in the versioned reproducibility archive (https://doi.org/10.5281/zenodo.21935720); source datasets remain available from their cited repositories.</w:t>
+        <w:t>. UK-DALE, REFIT, SHEERM, ECL and the OpenML-CC18 tasks are publicly available from their originating repositories and are cited in the relevant methods sections. No new raw data were generated. Dataset-selection manifests, compact derived summaries and the 17 OpenML-CC18 per-task prediction artifacts are included in the versioned reproducibility archive (https://doi.org/10.5281/zenodo.21935719); source datasets remain available from their cited repositories.</w:t>
       </w:r>
     </w:p>
     <w:p>
@@ -11001,7 +11001,7 @@
         <w:rPr>
           <w:lang w:val="en-US"/>
         </w:rPr>
-        <w:t>. Source code, environment specifications, registrations, deviation logs, manifests and result-generation scripts corresponding to version 1.0.0 are publicly archived at Zenodo (https://doi.org/10.5281/zenodo.21935720). Development history is available at https://github.com/tohmetovakylbek-creator/training-randomness-ablation-validity.</w:t>
+        <w:t>. Source code, environment specifications, registrations, deviation logs, manifests and result-generation scripts corresponding to version 1.0.0 are publicly archived at Zenodo (https://doi.org/10.5281/zenodo.21935719). Development history is available at https://github.com/tohmetovakylbek-creator/training-randomness-ablation-validity.</w:t>
       </w:r>
     </w:p>
     <w:p>

</xml_diff>